<commit_message>
mobile app 틀 구현 (Expo SDK 54)
</commit_message>
<xml_diff>
--- a/backend/template_word.docx
+++ b/backend/template_word.docx
@@ -17,15 +17,15 @@
         <mc:AlternateContent>
           <mc:Choice Requires="wps">
             <w:drawing>
-              <wp:anchor distT="0" distB="0" distL="114300" distR="114300" simplePos="0" relativeHeight="251661312" behindDoc="0" locked="0" layoutInCell="1" allowOverlap="1" wp14:anchorId="2499ABF9" wp14:editId="1078028E">
+              <wp:anchor distT="0" distB="0" distL="114300" distR="114300" simplePos="0" relativeHeight="251661312" behindDoc="0" locked="0" layoutInCell="1" allowOverlap="1" wp14:anchorId="2499ABF9" wp14:editId="42EA383C">
                 <wp:simplePos x="0" y="0"/>
                 <wp:positionH relativeFrom="page">
                   <wp:align>right</wp:align>
                 </wp:positionH>
                 <wp:positionV relativeFrom="paragraph">
-                  <wp:posOffset>0</wp:posOffset>
+                  <wp:posOffset>331470</wp:posOffset>
                 </wp:positionV>
-                <wp:extent cx="7562850" cy="1734185"/>
+                <wp:extent cx="7562850" cy="1402715"/>
                 <wp:effectExtent l="0" t="0" r="0" b="0"/>
                 <wp:wrapNone/>
                 <wp:docPr id="154312045" name="Textbox 10"/>
@@ -37,7 +37,7 @@
                       <wps:spPr>
                         <a:xfrm>
                           <a:off x="0" y="0"/>
-                          <a:ext cx="7562850" cy="1734185"/>
+                          <a:ext cx="7562850" cy="1402715"/>
                         </a:xfrm>
                         <a:prstGeom prst="rect">
                           <a:avLst/>
@@ -51,30 +51,8 @@
                               <w:jc w:val="both"/>
                               <w:rPr>
                                 <w:rFonts w:asciiTheme="majorEastAsia" w:eastAsiaTheme="majorEastAsia" w:hAnsiTheme="majorEastAsia"/>
-                                <w:sz w:val="12"/>
-                                <w:szCs w:val="18"/>
-                              </w:rPr>
-                            </w:pPr>
-                          </w:p>
-                          <w:p>
-                            <w:pPr>
-                              <w:spacing w:after="0" w:line="10" w:lineRule="atLeast"/>
-                              <w:jc w:val="both"/>
-                              <w:rPr>
-                                <w:rFonts w:asciiTheme="majorEastAsia" w:eastAsiaTheme="majorEastAsia" w:hAnsiTheme="majorEastAsia"/>
-                                <w:sz w:val="12"/>
-                                <w:szCs w:val="18"/>
-                              </w:rPr>
-                            </w:pPr>
-                          </w:p>
-                          <w:p>
-                            <w:pPr>
-                              <w:spacing w:after="0" w:line="10" w:lineRule="atLeast"/>
-                              <w:jc w:val="both"/>
-                              <w:rPr>
-                                <w:rFonts w:asciiTheme="majorEastAsia" w:eastAsiaTheme="majorEastAsia" w:hAnsiTheme="majorEastAsia"/>
-                                <w:sz w:val="12"/>
-                                <w:szCs w:val="18"/>
+                                <w:sz w:val="10"/>
+                                <w:szCs w:val="16"/>
                               </w:rPr>
                             </w:pPr>
                           </w:p>
@@ -86,8 +64,8 @@
                               <w:rPr>
                                 <w:rFonts w:asciiTheme="majorEastAsia" w:eastAsiaTheme="majorEastAsia" w:hAnsiTheme="majorEastAsia"/>
                                 <w:b/>
-                                <w:sz w:val="12"/>
-                                <w:szCs w:val="18"/>
+                                <w:sz w:val="10"/>
+                                <w:szCs w:val="16"/>
                               </w:rPr>
                             </w:pPr>
                             <w:r>
@@ -95,8 +73,8 @@
                                 <w:rFonts w:asciiTheme="majorEastAsia" w:eastAsiaTheme="majorEastAsia" w:hAnsiTheme="majorEastAsia"/>
                                 <w:spacing w:val="-10"/>
                                 <w:w w:val="110"/>
-                                <w:sz w:val="48"/>
-                                <w:szCs w:val="18"/>
+                                <w:sz w:val="44"/>
+                                <w:szCs w:val="16"/>
                               </w:rPr>
                               <w:t>Letter</w:t>
                             </w:r>
@@ -105,8 +83,8 @@
                                 <w:rFonts w:asciiTheme="majorEastAsia" w:eastAsiaTheme="majorEastAsia" w:hAnsiTheme="majorEastAsia"/>
                                 <w:spacing w:val="-46"/>
                                 <w:w w:val="110"/>
-                                <w:sz w:val="48"/>
-                                <w:szCs w:val="18"/>
+                                <w:sz w:val="44"/>
+                                <w:szCs w:val="16"/>
                               </w:rPr>
                               <w:t xml:space="preserve"> </w:t>
                             </w:r>
@@ -115,8 +93,8 @@
                                 <w:rFonts w:asciiTheme="majorEastAsia" w:eastAsiaTheme="majorEastAsia" w:hAnsiTheme="majorEastAsia"/>
                                 <w:spacing w:val="-10"/>
                                 <w:w w:val="110"/>
-                                <w:sz w:val="48"/>
-                                <w:szCs w:val="18"/>
+                                <w:sz w:val="44"/>
+                                <w:szCs w:val="16"/>
                               </w:rPr>
                               <w:t>of</w:t>
                             </w:r>
@@ -125,8 +103,8 @@
                                 <w:rFonts w:asciiTheme="majorEastAsia" w:eastAsiaTheme="majorEastAsia" w:hAnsiTheme="majorEastAsia"/>
                                 <w:spacing w:val="-45"/>
                                 <w:w w:val="110"/>
-                                <w:sz w:val="48"/>
-                                <w:szCs w:val="18"/>
+                                <w:sz w:val="44"/>
+                                <w:szCs w:val="16"/>
                               </w:rPr>
                               <w:t xml:space="preserve"> </w:t>
                             </w:r>
@@ -135,8 +113,8 @@
                                 <w:rFonts w:asciiTheme="majorEastAsia" w:eastAsiaTheme="majorEastAsia" w:hAnsiTheme="majorEastAsia"/>
                                 <w:spacing w:val="-10"/>
                                 <w:w w:val="110"/>
-                                <w:sz w:val="48"/>
-                                <w:szCs w:val="18"/>
+                                <w:sz w:val="44"/>
+                                <w:szCs w:val="16"/>
                               </w:rPr>
                               <w:t>Intent</w:t>
                             </w:r>
@@ -145,8 +123,8 @@
                                 <w:rFonts w:asciiTheme="majorEastAsia" w:eastAsiaTheme="majorEastAsia" w:hAnsiTheme="majorEastAsia"/>
                                 <w:spacing w:val="-45"/>
                                 <w:w w:val="110"/>
-                                <w:sz w:val="48"/>
-                                <w:szCs w:val="18"/>
+                                <w:sz w:val="44"/>
+                                <w:szCs w:val="16"/>
                               </w:rPr>
                               <w:t xml:space="preserve"> </w:t>
                             </w:r>
@@ -155,8 +133,8 @@
                                 <w:rFonts w:asciiTheme="majorEastAsia" w:eastAsiaTheme="majorEastAsia" w:hAnsiTheme="majorEastAsia"/>
                                 <w:spacing w:val="-10"/>
                                 <w:w w:val="110"/>
-                                <w:sz w:val="48"/>
-                                <w:szCs w:val="18"/>
+                                <w:sz w:val="44"/>
+                                <w:szCs w:val="16"/>
                               </w:rPr>
                               <w:t>to</w:t>
                             </w:r>
@@ -169,16 +147,16 @@
                               <w:rPr>
                                 <w:rFonts w:asciiTheme="majorEastAsia" w:eastAsiaTheme="majorEastAsia" w:hAnsiTheme="majorEastAsia"/>
                                 <w:b/>
-                                <w:sz w:val="48"/>
-                                <w:szCs w:val="18"/>
+                                <w:sz w:val="44"/>
+                                <w:szCs w:val="16"/>
                               </w:rPr>
                             </w:pPr>
                             <w:r>
                               <w:rPr>
                                 <w:rFonts w:asciiTheme="majorEastAsia" w:eastAsiaTheme="majorEastAsia" w:hAnsiTheme="majorEastAsia"/>
                                 <w:b/>
-                                <w:sz w:val="48"/>
-                                <w:szCs w:val="18"/>
+                                <w:sz w:val="44"/>
+                                <w:szCs w:val="16"/>
                               </w:rPr>
                               <w:t>Purchase</w:t>
                             </w:r>
@@ -187,8 +165,8 @@
                                 <w:rFonts w:asciiTheme="majorEastAsia" w:eastAsiaTheme="majorEastAsia" w:hAnsiTheme="majorEastAsia"/>
                                 <w:b/>
                                 <w:spacing w:val="-48"/>
-                                <w:sz w:val="48"/>
-                                <w:szCs w:val="18"/>
+                                <w:sz w:val="44"/>
+                                <w:szCs w:val="16"/>
                               </w:rPr>
                               <w:t xml:space="preserve"> </w:t>
                             </w:r>
@@ -196,8 +174,8 @@
                               <w:rPr>
                                 <w:rFonts w:asciiTheme="majorEastAsia" w:eastAsiaTheme="majorEastAsia" w:hAnsiTheme="majorEastAsia"/>
                                 <w:b/>
-                                <w:sz w:val="48"/>
-                                <w:szCs w:val="18"/>
+                                <w:sz w:val="44"/>
+                                <w:szCs w:val="16"/>
                               </w:rPr>
                               <w:t>a</w:t>
                             </w:r>
@@ -206,8 +184,8 @@
                                 <w:rFonts w:asciiTheme="majorEastAsia" w:eastAsiaTheme="majorEastAsia" w:hAnsiTheme="majorEastAsia"/>
                                 <w:b/>
                                 <w:spacing w:val="-48"/>
-                                <w:sz w:val="48"/>
-                                <w:szCs w:val="18"/>
+                                <w:sz w:val="44"/>
+                                <w:szCs w:val="16"/>
                               </w:rPr>
                               <w:t xml:space="preserve"> </w:t>
                             </w:r>
@@ -216,8 +194,8 @@
                                 <w:rFonts w:asciiTheme="majorEastAsia" w:eastAsiaTheme="majorEastAsia" w:hAnsiTheme="majorEastAsia"/>
                                 <w:b/>
                                 <w:spacing w:val="-2"/>
-                                <w:sz w:val="48"/>
-                                <w:szCs w:val="18"/>
+                                <w:sz w:val="44"/>
+                                <w:szCs w:val="16"/>
                               </w:rPr>
                               <w:t>Business</w:t>
                             </w:r>
@@ -226,8 +204,8 @@
                                 <w:rFonts w:asciiTheme="majorEastAsia" w:eastAsiaTheme="majorEastAsia" w:hAnsiTheme="majorEastAsia"/>
                                 <w:b/>
                                 <w:spacing w:val="-2"/>
-                                <w:sz w:val="48"/>
-                                <w:szCs w:val="18"/>
+                                <w:sz w:val="44"/>
+                                <w:szCs w:val="16"/>
                               </w:rPr>
                               <w:t xml:space="preserve"> </w:t>
                             </w:r>
@@ -255,7 +233,7 @@
                 <v:stroke joinstyle="miter"/>
                 <v:path gradientshapeok="t" o:connecttype="rect"/>
               </v:shapetype>
-              <v:shape id="Textbox 10" o:spid="_x0000_s1026" type="#_x0000_t202" style="position:absolute;margin-left:544.3pt;margin-top:0;width:595.5pt;height:136.55pt;z-index:251661312;visibility:visible;mso-wrap-style:square;mso-width-percent:0;mso-height-percent:0;mso-wrap-distance-left:9pt;mso-wrap-distance-top:0;mso-wrap-distance-right:9pt;mso-wrap-distance-bottom:0;mso-position-horizontal:right;mso-position-horizontal-relative:page;mso-position-vertical:absolute;mso-position-vertical-relative:text;mso-width-percent:0;mso-height-percent:0;mso-width-relative:margin;mso-height-relative:margin;v-text-anchor:top" o:gfxdata="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" filled="f" stroked="f">
+              <v:shape id="Textbox 10" o:spid="_x0000_s1026" type="#_x0000_t202" style="position:absolute;margin-left:544.3pt;margin-top:26.1pt;width:595.5pt;height:110.45pt;z-index:251661312;visibility:visible;mso-wrap-style:square;mso-width-percent:0;mso-height-percent:0;mso-wrap-distance-left:9pt;mso-wrap-distance-top:0;mso-wrap-distance-right:9pt;mso-wrap-distance-bottom:0;mso-position-horizontal:right;mso-position-horizontal-relative:page;mso-position-vertical:absolute;mso-position-vertical-relative:text;mso-width-percent:0;mso-height-percent:0;mso-width-relative:margin;mso-height-relative:margin;v-text-anchor:top" o:gfxdata="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" filled="f" stroked="f">
                 <v:textbox inset="0,0,0,0">
                   <w:txbxContent>
                     <w:p>
@@ -264,30 +242,8 @@
                         <w:jc w:val="both"/>
                         <w:rPr>
                           <w:rFonts w:asciiTheme="majorEastAsia" w:eastAsiaTheme="majorEastAsia" w:hAnsiTheme="majorEastAsia"/>
-                          <w:sz w:val="12"/>
-                          <w:szCs w:val="18"/>
-                        </w:rPr>
-                      </w:pPr>
-                    </w:p>
-                    <w:p>
-                      <w:pPr>
-                        <w:spacing w:after="0" w:line="10" w:lineRule="atLeast"/>
-                        <w:jc w:val="both"/>
-                        <w:rPr>
-                          <w:rFonts w:asciiTheme="majorEastAsia" w:eastAsiaTheme="majorEastAsia" w:hAnsiTheme="majorEastAsia"/>
-                          <w:sz w:val="12"/>
-                          <w:szCs w:val="18"/>
-                        </w:rPr>
-                      </w:pPr>
-                    </w:p>
-                    <w:p>
-                      <w:pPr>
-                        <w:spacing w:after="0" w:line="10" w:lineRule="atLeast"/>
-                        <w:jc w:val="both"/>
-                        <w:rPr>
-                          <w:rFonts w:asciiTheme="majorEastAsia" w:eastAsiaTheme="majorEastAsia" w:hAnsiTheme="majorEastAsia"/>
-                          <w:sz w:val="12"/>
-                          <w:szCs w:val="18"/>
+                          <w:sz w:val="10"/>
+                          <w:szCs w:val="16"/>
                         </w:rPr>
                       </w:pPr>
                     </w:p>
@@ -299,8 +255,8 @@
                         <w:rPr>
                           <w:rFonts w:asciiTheme="majorEastAsia" w:eastAsiaTheme="majorEastAsia" w:hAnsiTheme="majorEastAsia"/>
                           <w:b/>
-                          <w:sz w:val="12"/>
-                          <w:szCs w:val="18"/>
+                          <w:sz w:val="10"/>
+                          <w:szCs w:val="16"/>
                         </w:rPr>
                       </w:pPr>
                       <w:r>
@@ -308,8 +264,8 @@
                           <w:rFonts w:asciiTheme="majorEastAsia" w:eastAsiaTheme="majorEastAsia" w:hAnsiTheme="majorEastAsia"/>
                           <w:spacing w:val="-10"/>
                           <w:w w:val="110"/>
-                          <w:sz w:val="48"/>
-                          <w:szCs w:val="18"/>
+                          <w:sz w:val="44"/>
+                          <w:szCs w:val="16"/>
                         </w:rPr>
                         <w:t>Letter</w:t>
                       </w:r>
@@ -318,8 +274,8 @@
                           <w:rFonts w:asciiTheme="majorEastAsia" w:eastAsiaTheme="majorEastAsia" w:hAnsiTheme="majorEastAsia"/>
                           <w:spacing w:val="-46"/>
                           <w:w w:val="110"/>
-                          <w:sz w:val="48"/>
-                          <w:szCs w:val="18"/>
+                          <w:sz w:val="44"/>
+                          <w:szCs w:val="16"/>
                         </w:rPr>
                         <w:t xml:space="preserve"> </w:t>
                       </w:r>
@@ -328,8 +284,8 @@
                           <w:rFonts w:asciiTheme="majorEastAsia" w:eastAsiaTheme="majorEastAsia" w:hAnsiTheme="majorEastAsia"/>
                           <w:spacing w:val="-10"/>
                           <w:w w:val="110"/>
-                          <w:sz w:val="48"/>
-                          <w:szCs w:val="18"/>
+                          <w:sz w:val="44"/>
+                          <w:szCs w:val="16"/>
                         </w:rPr>
                         <w:t>of</w:t>
                       </w:r>
@@ -338,8 +294,8 @@
                           <w:rFonts w:asciiTheme="majorEastAsia" w:eastAsiaTheme="majorEastAsia" w:hAnsiTheme="majorEastAsia"/>
                           <w:spacing w:val="-45"/>
                           <w:w w:val="110"/>
-                          <w:sz w:val="48"/>
-                          <w:szCs w:val="18"/>
+                          <w:sz w:val="44"/>
+                          <w:szCs w:val="16"/>
                         </w:rPr>
                         <w:t xml:space="preserve"> </w:t>
                       </w:r>
@@ -348,8 +304,8 @@
                           <w:rFonts w:asciiTheme="majorEastAsia" w:eastAsiaTheme="majorEastAsia" w:hAnsiTheme="majorEastAsia"/>
                           <w:spacing w:val="-10"/>
                           <w:w w:val="110"/>
-                          <w:sz w:val="48"/>
-                          <w:szCs w:val="18"/>
+                          <w:sz w:val="44"/>
+                          <w:szCs w:val="16"/>
                         </w:rPr>
                         <w:t>Intent</w:t>
                       </w:r>
@@ -358,8 +314,8 @@
                           <w:rFonts w:asciiTheme="majorEastAsia" w:eastAsiaTheme="majorEastAsia" w:hAnsiTheme="majorEastAsia"/>
                           <w:spacing w:val="-45"/>
                           <w:w w:val="110"/>
-                          <w:sz w:val="48"/>
-                          <w:szCs w:val="18"/>
+                          <w:sz w:val="44"/>
+                          <w:szCs w:val="16"/>
                         </w:rPr>
                         <w:t xml:space="preserve"> </w:t>
                       </w:r>
@@ -368,8 +324,8 @@
                           <w:rFonts w:asciiTheme="majorEastAsia" w:eastAsiaTheme="majorEastAsia" w:hAnsiTheme="majorEastAsia"/>
                           <w:spacing w:val="-10"/>
                           <w:w w:val="110"/>
-                          <w:sz w:val="48"/>
-                          <w:szCs w:val="18"/>
+                          <w:sz w:val="44"/>
+                          <w:szCs w:val="16"/>
                         </w:rPr>
                         <w:t>to</w:t>
                       </w:r>
@@ -382,16 +338,16 @@
                         <w:rPr>
                           <w:rFonts w:asciiTheme="majorEastAsia" w:eastAsiaTheme="majorEastAsia" w:hAnsiTheme="majorEastAsia"/>
                           <w:b/>
-                          <w:sz w:val="48"/>
-                          <w:szCs w:val="18"/>
+                          <w:sz w:val="44"/>
+                          <w:szCs w:val="16"/>
                         </w:rPr>
                       </w:pPr>
                       <w:r>
                         <w:rPr>
                           <w:rFonts w:asciiTheme="majorEastAsia" w:eastAsiaTheme="majorEastAsia" w:hAnsiTheme="majorEastAsia"/>
                           <w:b/>
-                          <w:sz w:val="48"/>
-                          <w:szCs w:val="18"/>
+                          <w:sz w:val="44"/>
+                          <w:szCs w:val="16"/>
                         </w:rPr>
                         <w:t>Purchase</w:t>
                       </w:r>
@@ -400,8 +356,8 @@
                           <w:rFonts w:asciiTheme="majorEastAsia" w:eastAsiaTheme="majorEastAsia" w:hAnsiTheme="majorEastAsia"/>
                           <w:b/>
                           <w:spacing w:val="-48"/>
-                          <w:sz w:val="48"/>
-                          <w:szCs w:val="18"/>
+                          <w:sz w:val="44"/>
+                          <w:szCs w:val="16"/>
                         </w:rPr>
                         <w:t xml:space="preserve"> </w:t>
                       </w:r>
@@ -409,8 +365,8 @@
                         <w:rPr>
                           <w:rFonts w:asciiTheme="majorEastAsia" w:eastAsiaTheme="majorEastAsia" w:hAnsiTheme="majorEastAsia"/>
                           <w:b/>
-                          <w:sz w:val="48"/>
-                          <w:szCs w:val="18"/>
+                          <w:sz w:val="44"/>
+                          <w:szCs w:val="16"/>
                         </w:rPr>
                         <w:t>a</w:t>
                       </w:r>
@@ -419,8 +375,8 @@
                           <w:rFonts w:asciiTheme="majorEastAsia" w:eastAsiaTheme="majorEastAsia" w:hAnsiTheme="majorEastAsia"/>
                           <w:b/>
                           <w:spacing w:val="-48"/>
-                          <w:sz w:val="48"/>
-                          <w:szCs w:val="18"/>
+                          <w:sz w:val="44"/>
+                          <w:szCs w:val="16"/>
                         </w:rPr>
                         <w:t xml:space="preserve"> </w:t>
                       </w:r>
@@ -429,8 +385,8 @@
                           <w:rFonts w:asciiTheme="majorEastAsia" w:eastAsiaTheme="majorEastAsia" w:hAnsiTheme="majorEastAsia"/>
                           <w:b/>
                           <w:spacing w:val="-2"/>
-                          <w:sz w:val="48"/>
-                          <w:szCs w:val="18"/>
+                          <w:sz w:val="44"/>
+                          <w:szCs w:val="16"/>
                         </w:rPr>
                         <w:t>Business</w:t>
                       </w:r>
@@ -439,8 +395,8 @@
                           <w:rFonts w:asciiTheme="majorEastAsia" w:eastAsiaTheme="majorEastAsia" w:hAnsiTheme="majorEastAsia"/>
                           <w:b/>
                           <w:spacing w:val="-2"/>
-                          <w:sz w:val="48"/>
-                          <w:szCs w:val="18"/>
+                          <w:sz w:val="44"/>
+                          <w:szCs w:val="16"/>
                         </w:rPr>
                         <w:t xml:space="preserve"> </w:t>
                       </w:r>
@@ -719,7 +675,7 @@
               </wp:anchor>
             </w:drawing>
           </mc:Choice>
-          <mc:Fallback xmlns:oel="http://schemas.microsoft.com/office/2019/extlst" xmlns:w16du="http://schemas.microsoft.com/office/word/2023/wordml/word16du" xmlns:w16sdtfl="http://schemas.microsoft.com/office/word/2024/wordml/sdtformatlock">
+          <mc:Fallback xmlns:w16sdtfl="http://schemas.microsoft.com/office/word/2024/wordml/sdtformatlock" xmlns:w16du="http://schemas.microsoft.com/office/word/2023/wordml/word16du" xmlns:oel="http://schemas.microsoft.com/office/2019/extlst">
             <w:pict>
               <v:shape w14:anchorId="2EF35057" id="Graphic 3" o:spid="_x0000_s1026" style="position:absolute;margin-left:-73.4pt;margin-top:-41.9pt;width:595.5pt;height:27.75pt;z-index:251654144;visibility:visible;mso-wrap-style:square;mso-wrap-distance-left:9pt;mso-wrap-distance-top:0;mso-wrap-distance-right:9pt;mso-wrap-distance-bottom:0;mso-position-horizontal:absolute;mso-position-horizontal-relative:text;mso-position-vertical:absolute;mso-position-vertical-relative:text;v-text-anchor:top" coordsize="7562850,352425" o:gfxdata="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" path="m7562849,351803l,351803,,,7562849,r,351803xe" fillcolor="#6f98fa" stroked="f">
                 <v:path arrowok="t"/>
@@ -801,7 +757,7 @@
               </wp:anchor>
             </w:drawing>
           </mc:Choice>
-          <mc:Fallback xmlns:oel="http://schemas.microsoft.com/office/2019/extlst" xmlns:w16du="http://schemas.microsoft.com/office/word/2023/wordml/word16du" xmlns:w16sdtfl="http://schemas.microsoft.com/office/word/2024/wordml/sdtformatlock">
+          <mc:Fallback xmlns:w16sdtfl="http://schemas.microsoft.com/office/word/2024/wordml/sdtformatlock" xmlns:w16du="http://schemas.microsoft.com/office/word/2023/wordml/word16du" xmlns:oel="http://schemas.microsoft.com/office/2019/extlst">
             <w:pict>
               <v:shape w14:anchorId="690CC9B8" id="Graphic 4" o:spid="_x0000_s1026" style="position:absolute;margin-left:-73.4pt;margin-top:-15.1pt;width:595.5pt;height:1.8pt;z-index:251655168;visibility:visible;mso-wrap-style:square;mso-wrap-distance-left:9pt;mso-wrap-distance-top:0;mso-wrap-distance-right:9pt;mso-wrap-distance-bottom:0;mso-position-horizontal:absolute;mso-position-horizontal-relative:text;mso-position-vertical:absolute;mso-position-vertical-relative:text;v-text-anchor:top" coordsize="7562850,22860" o:gfxdata="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" path="m,l7562849,r,22688l,22688,,xe" fillcolor="black" stroked="f">
                 <v:path arrowok="t"/>
@@ -940,7 +896,7 @@
               </wp:anchor>
             </w:drawing>
           </mc:Choice>
-          <mc:Fallback xmlns:oel="http://schemas.microsoft.com/office/2019/extlst" xmlns:w16du="http://schemas.microsoft.com/office/word/2023/wordml/word16du" xmlns:w16sdtfl="http://schemas.microsoft.com/office/word/2024/wordml/sdtformatlock">
+          <mc:Fallback xmlns:w16sdtfl="http://schemas.microsoft.com/office/word/2024/wordml/sdtformatlock" xmlns:w16du="http://schemas.microsoft.com/office/word/2023/wordml/word16du" xmlns:oel="http://schemas.microsoft.com/office/2019/extlst">
             <w:pict>
               <v:shape w14:anchorId="1FD2E39F" id="Graphic 5" o:spid="_x0000_s1026" style="position:absolute;margin-left:-11.15pt;margin-top:3.95pt;width:132.25pt;height:22.25pt;z-index:251656192;visibility:visible;mso-wrap-style:square;mso-wrap-distance-left:9pt;mso-wrap-distance-top:0;mso-wrap-distance-right:9pt;mso-wrap-distance-bottom:0;mso-position-horizontal:absolute;mso-position-horizontal-relative:text;mso-position-vertical:absolute;mso-position-vertical-relative:text;v-text-anchor:top" coordsize="1679575,282575" o:gfxdata="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" path="m1538667,282092r-1397621,l96464,274902,57746,254878,27213,224346,7190,185627,,141046,7190,96464,27213,57746,57746,27213,96464,7190,141046,,1538667,r44581,7190l1621967,27213r30532,30533l1672523,96464r6810,42223l1679333,143405r-6810,42222l1652499,224346r-30532,30532l1583248,274902r-44581,7190xe" fillcolor="#6f98fa" stroked="f">
                 <v:path arrowok="t"/>
@@ -1078,7 +1034,7 @@
               </wp:anchor>
             </w:drawing>
           </mc:Choice>
-          <mc:Fallback xmlns:oel="http://schemas.microsoft.com/office/2019/extlst" xmlns:w16du="http://schemas.microsoft.com/office/word/2023/wordml/word16du" xmlns:w16sdtfl="http://schemas.microsoft.com/office/word/2024/wordml/sdtformatlock">
+          <mc:Fallback xmlns:w16sdtfl="http://schemas.microsoft.com/office/word/2024/wordml/sdtformatlock" xmlns:w16du="http://schemas.microsoft.com/office/word/2023/wordml/word16du" xmlns:oel="http://schemas.microsoft.com/office/2019/extlst">
             <w:pict>
               <v:shape w14:anchorId="1D206788" id="Graphic 6" o:spid="_x0000_s1026" style="position:absolute;margin-left:-11.15pt;margin-top:3.95pt;width:132.2pt;height:22.25pt;z-index:251657216;visibility:visible;mso-wrap-style:square;mso-wrap-distance-left:9pt;mso-wrap-distance-top:0;mso-wrap-distance-right:9pt;mso-wrap-distance-bottom:0;mso-position-horizontal:absolute;mso-position-horizontal-relative:text;mso-position-vertical:absolute;mso-position-vertical-relative:text;v-text-anchor:top" coordsize="1678939,282575" o:gfxdata="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" path="m1678868,145756r-6361,39902l1652461,224387r-30557,30527l1583167,274919r-44584,7178l141068,282101,96478,274915,57751,254891,27211,224352,7186,185624,,141033,7199,96447,27232,57729,57772,27203,96493,7190,141072,,1538583,4r44596,7156l1621920,27173r30556,30537l1672516,96447r6346,39899e" filled="f" strokeweight=".42014mm">
                 <v:path arrowok="t"/>
@@ -1243,7 +1199,7 @@
               </wp:anchor>
             </w:drawing>
           </mc:Choice>
-          <mc:Fallback xmlns:oel="http://schemas.microsoft.com/office/2019/extlst" xmlns:w16du="http://schemas.microsoft.com/office/word/2023/wordml/word16du" xmlns:w16sdtfl="http://schemas.microsoft.com/office/word/2024/wordml/sdtformatlock">
+          <mc:Fallback xmlns:w16sdtfl="http://schemas.microsoft.com/office/word/2024/wordml/sdtformatlock" xmlns:w16du="http://schemas.microsoft.com/office/word/2023/wordml/word16du" xmlns:oel="http://schemas.microsoft.com/office/2019/extlst">
             <w:pict>
               <v:shape w14:anchorId="19D13E3E" id="Graphic 8" o:spid="_x0000_s1026" style="position:absolute;margin-left:394.8pt;margin-top:28.55pt;width:43.65pt;height:70.75pt;z-index:251659264;visibility:visible;mso-wrap-style:square;mso-wrap-distance-left:9pt;mso-wrap-distance-top:0;mso-wrap-distance-right:9pt;mso-wrap-distance-bottom:0;mso-position-horizontal:absolute;mso-position-horizontal-relative:text;mso-position-vertical:absolute;mso-position-vertical-relative:text;v-text-anchor:top" coordsize="554355,898525" o:gfxdata="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" path="m539790,898211r-525504,l10900,896808,2390,888298,,882527,,16671,2390,10900,10900,2390,16671,,537406,r5771,2390l551686,10900r2391,5771l554077,882527r-2391,5771l543177,896808r-3387,1403xe" fillcolor="#6f98fa" stroked="f">
                 <v:path arrowok="t"/>
@@ -2098,7 +2054,7 @@
               </wp:anchor>
             </w:drawing>
           </mc:Choice>
-          <mc:Fallback xmlns:oel="http://schemas.microsoft.com/office/2019/extlst" xmlns:w16du="http://schemas.microsoft.com/office/word/2023/wordml/word16du" xmlns:w16sdtfl="http://schemas.microsoft.com/office/word/2024/wordml/sdtformatlock">
+          <mc:Fallback xmlns:w16sdtfl="http://schemas.microsoft.com/office/word/2024/wordml/sdtformatlock" xmlns:w16du="http://schemas.microsoft.com/office/word/2023/wordml/word16du" xmlns:oel="http://schemas.microsoft.com/office/2019/extlst">
             <w:pict>
               <v:shape w14:anchorId="2A2AD707" id="Graphic 9" o:spid="_x0000_s1026" style="position:absolute;margin-left:404.65pt;margin-top:5.95pt;width:71.9pt;height:69pt;z-index:251660288;visibility:visible;mso-wrap-style:square;mso-wrap-distance-left:9pt;mso-wrap-distance-top:0;mso-wrap-distance-right:9pt;mso-wrap-distance-bottom:0;mso-position-horizontal:absolute;mso-position-horizontal-relative:text;mso-position-vertical:absolute;mso-position-vertical-relative:text;v-text-anchor:top" coordsize="913130,876300" o:gfxdata="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" path="m704982,876300r-692240,l10869,875030,7272,873760,,11430,370,10160,10864,,500457,r3763,1270l507141,5080r21995,22860l29387,27940r,819150l717721,847090r,16510l706856,875030r-1874,1270xem623296,688340l609580,675640r189,-3810l615262,576580,688370,434340r,-190500l492039,243840r-3602,-2540l486848,241300r-2756,-3810l483030,236220r-1492,-3810l481165,231140r,-203200l529136,27940r21995,22860l510482,50800r,163830l708762,214630r8174,11430l717309,227330r220,l717598,378460r33225,l716589,443230,649400,571500r44856,22860l727528,594360r-3336,6350l643021,600710r-2253,41910l688370,642620r-54452,41910l631703,685800r-2568,1270l623296,688340xem708762,214630r-40067,l510482,50800r40649,l708762,214630xem360143,149860r-4375,l163686,147320r-4375,l146869,133350r,-5080l147296,125730r1707,-3810l150218,120650r3154,-3810l155190,115570r4121,-1270l163686,114300r192082,2540l360143,116840r4120,1270l366082,119380r3154,3810l370451,124460r1707,3810l372584,130810r,3810l364263,147320r-4120,2540xem750823,378460r-33225,l815244,193040r1189,-1270l819403,189230r1667,l824769,187960r7575,l895122,220980r-61611,l820775,246380r44844,22860l898336,269240r-1334,2540l807209,271780,750823,378460xem357998,246380r-2230,l163686,243840r-2230,l159311,242570r-4121,-1270l153372,240030r-3154,-2540l149003,234950r-1707,-3810l146869,228600r,-3810l159311,210820r2145,-1270l163686,209550r192082,2540l357998,212090r2145,1270l364263,214630r1819,1270l369236,218440r1215,2540l372158,224790r426,2540l372584,231140r-12441,13970l357998,246380xem898336,269240r-32717,l878355,245110,833511,220980r61611,l904780,226060r7866,10160l912601,241300r-122,1270l911930,243840r-916,1270l898336,269240xem727528,594360r-33272,l852054,294640,807209,271780r89793,l727528,594360xem539126,388620r-2230,l163686,386080r-2230,l159311,384810r-4121,-1270l153372,382270r-3154,-2540l149003,377190r-1707,-3810l146869,370840r,-3810l147296,364490r1707,-3810l150218,359410r3154,-3810l155190,354330r4121,-1270l161456,351790r2230,l539115,354330r2145,1270l545381,356870r8327,16510l553282,375920r-12011,11430l539126,388620xem541271,508000r-4375,l163686,505460r-4375,l155190,504190r-1818,-1270l150218,499110r-1215,-1270l146869,491490r,-5080l159311,472440r4375,l541260,474980r4121,2540l547200,477520r3155,3810l551571,482600r2135,6350l553708,494030r-2132,6350l550362,501650r-3153,3810l545391,506730r-4120,1270xem539126,633730r-2230,l163686,631190r-2230,l159311,629920r-4121,-1270l153372,627380r-3154,-2540l149003,622300r-1707,-3810l146869,615950r,-3810l159311,598170r2145,-1270l163686,596900r375429,2540l541260,600710r4121,1270l553708,618490r-426,2540l541271,632460r-2145,1270xem717721,847090r-29351,l688370,642620r-47602,l673538,615950,643021,600710r81171,l717519,613410r202,l717721,847090xem376377,750570r-4376,l163686,749300r-4375,l155190,748030r-1818,-1270l150218,742950r-1215,-1270l147296,737870r-427,-2540l146869,730250r12442,-13970l376388,717550r4120,1270l382326,720090r3153,3810l386693,725170r1706,3810l388825,731520r-2,3810l380498,748030r-4121,2540xe" fillcolor="black" stroked="f">
                 <v:path arrowok="t"/>
@@ -2988,6 +2944,7 @@
   <w:style w:type="character" w:default="1" w:styleId="a0">
     <w:name w:val="Default Paragraph Font"/>
     <w:uiPriority w:val="1"/>
+    <w:semiHidden/>
     <w:unhideWhenUsed/>
   </w:style>
   <w:style w:type="table" w:default="1" w:styleId="a1">

</xml_diff>